<commit_message>
Update prompt history (Phase 3, prompts 27-41) and add pending info page to improvements doc
Co-Authored-By: Claude Sonnet 4.6 <noreply@anthropic.com>
</commit_message>
<xml_diff>
--- a/ADC_Prompts_Historial.docx
+++ b/ADC_Prompts_Historial.docx
@@ -941,6 +941,269 @@
           <w:color w:val="1A8F4E"/>
         </w:rPr>
         <w:t>ADC_Prompts_Historial.docx fully updated to include all 26 prompts across both Phase 1 (initial website creation) and Phase 2 (updates and refinements).</w:t>
+      </w:r>
+    </w:p>
+    <w:p/>
+    <w:p>
+      <w:r>
+        <w:br w:type="page"/>
+      </w:r>
+    </w:p>
+    <w:p>
+      <w:pPr>
+        <w:pStyle w:val="Heading1"/>
+      </w:pPr>
+      <w:r>
+        <w:t>Phase 3 — Website Improvements &amp; Optimization</w:t>
+      </w:r>
+    </w:p>
+    <w:p>
+      <w:r>
+        <w:rPr>
+          <w:color w:val="555555"/>
+          <w:sz w:val="20"/>
+        </w:rPr>
+        <w:t>Session Date: March 15, 2026</w:t>
+      </w:r>
+    </w:p>
+    <w:p/>
+    <w:p>
+      <w:r>
+        <w:rPr>
+          <w:b/>
+          <w:sz w:val="22"/>
+        </w:rPr>
+        <w:t xml:space="preserve">Prompt 27:  </w:t>
+      </w:r>
+      <w:r>
+        <w:rPr>
+          <w:sz w:val="22"/>
+        </w:rPr>
+        <w:t>Replace the "Como Atleta" link to go directly to the athlete Google Form (for athletes only). Replace the organization card with the Metropolitan School of Panama and link to the MET form.</w:t>
+      </w:r>
+    </w:p>
+    <w:p/>
+    <w:p>
+      <w:r>
+        <w:rPr>
+          <w:b/>
+          <w:sz w:val="22"/>
+        </w:rPr>
+        <w:t xml:space="preserve">Prompt 28:  </w:t>
+      </w:r>
+      <w:r>
+        <w:rPr>
+          <w:sz w:val="22"/>
+        </w:rPr>
+        <w:t>Remove the Inscribete section with the embedded athlete form and MET form that were repeated below the cards on the Participate page.</w:t>
+      </w:r>
+    </w:p>
+    <w:p/>
+    <w:p>
+      <w:r>
+        <w:rPr>
+          <w:b/>
+          <w:sz w:val="22"/>
+        </w:rPr>
+        <w:t xml:space="preserve">Prompt 29:  </w:t>
+      </w:r>
+      <w:r>
+        <w:rPr>
+          <w:sz w:val="22"/>
+        </w:rPr>
+        <w:t>Come up with a list of potential improvements for the ADC website by researching other soccer nonprofit websites (Common Goal, Grassroot Soccer, U.S. Soccer Foundation, Soccer Without Borders, Gift of Soccer).</w:t>
+      </w:r>
+    </w:p>
+    <w:p/>
+    <w:p>
+      <w:r>
+        <w:rPr>
+          <w:b/>
+          <w:sz w:val="22"/>
+        </w:rPr>
+        <w:t xml:space="preserve">Prompt 30:  </w:t>
+      </w:r>
+      <w:r>
+        <w:rPr>
+          <w:sz w:val="22"/>
+        </w:rPr>
+        <w:t>Turn the website improvement list into a Word document in English saved in the my-website folder.</w:t>
+      </w:r>
+    </w:p>
+    <w:p/>
+    <w:p>
+      <w:r>
+        <w:rPr>
+          <w:b/>
+          <w:sz w:val="22"/>
+        </w:rPr>
+        <w:t xml:space="preserve">Prompt 31:  </w:t>
+      </w:r>
+      <w:r>
+        <w:rPr>
+          <w:sz w:val="22"/>
+        </w:rPr>
+        <w:t>Asked whether real data exists for recommendations 1 (Impact Stats) and 2 (Story Profiles) to fill them in accurately.</w:t>
+      </w:r>
+    </w:p>
+    <w:p/>
+    <w:p>
+      <w:r>
+        <w:rPr>
+          <w:b/>
+          <w:sz w:val="22"/>
+        </w:rPr>
+        <w:t xml:space="preserve">Prompt 32:  </w:t>
+      </w:r>
+      <w:r>
+        <w:rPr>
+          <w:sz w:val="22"/>
+        </w:rPr>
+        <w:t>Leaving info and data blank, add recommendations 1 and 2 to the website as templates for later input, using design inspiration from the researched nonprofit websites.</w:t>
+      </w:r>
+    </w:p>
+    <w:p/>
+    <w:p>
+      <w:r>
+        <w:rPr>
+          <w:b/>
+          <w:sz w:val="22"/>
+        </w:rPr>
+        <w:t xml:space="preserve">Prompt 33:  </w:t>
+      </w:r>
+      <w:r>
+        <w:rPr>
+          <w:sz w:val="22"/>
+        </w:rPr>
+        <w:t>Fix the navigation header order — clicking Blog was changing the nav order, moving Blog between Calendar and Participate instead of keeping it consistent.</w:t>
+      </w:r>
+    </w:p>
+    <w:p/>
+    <w:p>
+      <w:r>
+        <w:rPr>
+          <w:b/>
+          <w:sz w:val="22"/>
+        </w:rPr>
+        <w:t xml:space="preserve">Prompt 34:  </w:t>
+      </w:r>
+      <w:r>
+        <w:rPr>
+          <w:sz w:val="22"/>
+        </w:rPr>
+        <w:t>Make the website private from search engines but still accessible via direct shared link.</w:t>
+      </w:r>
+    </w:p>
+    <w:p/>
+    <w:p>
+      <w:r>
+        <w:rPr>
+          <w:b/>
+          <w:sz w:val="22"/>
+        </w:rPr>
+        <w:t xml:space="preserve">Prompt 35:  </w:t>
+      </w:r>
+      <w:r>
+        <w:rPr>
+          <w:sz w:val="22"/>
+        </w:rPr>
+        <w:t>What could a hacker pull from the ADC website? Context: a website view from Russia was noticed in analytics.</w:t>
+      </w:r>
+    </w:p>
+    <w:p/>
+    <w:p>
+      <w:r>
+        <w:rPr>
+          <w:b/>
+          <w:sz w:val="22"/>
+        </w:rPr>
+        <w:t xml:space="preserve">Prompt 36:  </w:t>
+      </w:r>
+      <w:r>
+        <w:rPr>
+          <w:sz w:val="22"/>
+        </w:rPr>
+        <w:t>How can the newest ADC Instagram posts be kept updated on the homepage? Walk through the possible options (manual, native embed, Behold.so, Instagram API).</w:t>
+      </w:r>
+    </w:p>
+    <w:p/>
+    <w:p>
+      <w:r>
+        <w:rPr>
+          <w:b/>
+          <w:sz w:val="22"/>
+        </w:rPr>
+        <w:t xml:space="preserve">Prompt 37:  </w:t>
+      </w:r>
+      <w:r>
+        <w:rPr>
+          <w:sz w:val="22"/>
+        </w:rPr>
+        <w:t>Walk through the Behold.so setup process for embedding a live Instagram feed.</w:t>
+      </w:r>
+    </w:p>
+    <w:p/>
+    <w:p>
+      <w:r>
+        <w:rPr>
+          <w:b/>
+          <w:sz w:val="22"/>
+        </w:rPr>
+        <w:t xml:space="preserve">Prompt 38:  </w:t>
+      </w:r>
+      <w:r>
+        <w:rPr>
+          <w:sz w:val="22"/>
+        </w:rPr>
+        <w:t>Combine the "Acerca de ADC" and "Quienes Somos" pages into a single "Acerca de ADC" tab containing: 3 leaders and their info, guiding principles, timeline, and achievements (logros). Keep the Nacimos en Curundu paragraphs.</w:t>
+      </w:r>
+    </w:p>
+    <w:p/>
+    <w:p>
+      <w:r>
+        <w:rPr>
+          <w:b/>
+          <w:sz w:val="22"/>
+        </w:rPr>
+        <w:t xml:space="preserve">Prompt 39:  </w:t>
+      </w:r>
+      <w:r>
+        <w:rPr>
+          <w:sz w:val="22"/>
+        </w:rPr>
+        <w:t>Implement the 12 website improvement recommendations from the nonprofit research. For each edit, present options and ask questions before implementing. Fill in accurate information where findable online.</w:t>
+      </w:r>
+    </w:p>
+    <w:p/>
+    <w:p>
+      <w:r>
+        <w:rPr>
+          <w:b/>
+          <w:sz w:val="22"/>
+        </w:rPr>
+        <w:t xml:space="preserve">Prompt 40:  </w:t>
+      </w:r>
+      <w:r>
+        <w:rPr>
+          <w:sz w:val="22"/>
+        </w:rPr>
+        <w:t>Confirmed option selections for each recommendation: #1 placeholder template, #2 placeholder, #3 Option A (homepage strip), #5 Option A (6 cards), #6 placeholder for later, #7 placeholder FAQ page, #11 Option A (footer text), #12 Option B (Common Goal style copy).</w:t>
+      </w:r>
+    </w:p>
+    <w:p/>
+    <w:p>
+      <w:r>
+        <w:rPr>
+          <w:b/>
+          <w:sz w:val="22"/>
+        </w:rPr>
+        <w:t xml:space="preserve">Prompt 41:  </w:t>
+      </w:r>
+      <w:r>
+        <w:rPr>
+          <w:sz w:val="22"/>
+        </w:rPr>
+        <w:t>Update the prompt history Word document, add a new page to the ADC Website Improvements document listing what info is still required, and label today's date (March 15, 2026).</w:t>
       </w:r>
     </w:p>
     <w:p/>

</xml_diff>

<commit_message>
Add AI project docs, presentation, scripts, and screenshots
Add gitignore for .DS_Store and Office temp files; remove previously
tracked junk files.

Co-Authored-By: Claude Opus 4.8 (1M context) <noreply@anthropic.com>
</commit_message>
<xml_diff>
--- a/ADC_Prompts_Historial.docx
+++ b/ADC_Prompts_Historial.docx
@@ -1207,6 +1207,380 @@
       </w:r>
     </w:p>
     <w:p/>
+    <w:p>
+      <w:pPr>
+        <w:pStyle w:val="Heading1"/>
+      </w:pPr>
+      <w:r>
+        <w:t>Phase 4 — Admin Dashboard &amp; Deployment</w:t>
+      </w:r>
+    </w:p>
+    <w:p>
+      <w:pPr/>
+      <w:r>
+        <w:t>Sessions: March 15 (continued), March 16, March 28, April 4, 2026</w:t>
+      </w:r>
+    </w:p>
+    <w:p>
+      <w:pPr/>
+      <w:r/>
+    </w:p>
+    <w:p>
+      <w:pPr>
+        <w:pStyle w:val="Heading2"/>
+      </w:pPr>
+      <w:r>
+        <w:t>Prompt 42: Add FAQ to nav, fill real impact stats, modernize blog filters</w:t>
+      </w:r>
+    </w:p>
+    <w:p>
+      <w:pPr/>
+      <w:r>
+        <w:rPr>
+          <w:b/>
+        </w:rPr>
+        <w:t xml:space="preserve">Request:  </w:t>
+      </w:r>
+      <w:r>
+        <w:t>Add the FAQ page link to the navigation bar across all pages. Fill in the real impact statistics on the About page (70+ athletes, 60+ families, 5+ years, 11 teams). Update the blog filter buttons to a more modern visual style.</w:t>
+      </w:r>
+    </w:p>
+    <w:p>
+      <w:pPr/>
+      <w:r>
+        <w:rPr>
+          <w:b/>
+        </w:rPr>
+        <w:t xml:space="preserve">Result:  </w:t>
+      </w:r>
+      <w:r>
+        <w:t>faq.html added to nav on all 11 pages. Impact stat counters updated with confirmed real numbers. Blog filter buttons restyled with a modernized pill design.</w:t>
+      </w:r>
+    </w:p>
+    <w:p>
+      <w:pPr/>
+      <w:r/>
+    </w:p>
+    <w:p>
+      <w:pPr>
+        <w:pStyle w:val="Heading2"/>
+      </w:pPr>
+      <w:r>
+        <w:t>Prompt 43: Reframe Acerca de ADC from problem-first to opportunity-led</w:t>
+      </w:r>
+    </w:p>
+    <w:p>
+      <w:pPr/>
+      <w:r>
+        <w:rPr>
+          <w:b/>
+        </w:rPr>
+        <w:t xml:space="preserve">Request:  </w:t>
+      </w:r>
+      <w:r>
+        <w:t>The Acerca de ADC page currently opens with a problem statement framing. Reframe it to lead with the opportunity and impact of ADC's work rather than the challenges of Curundú.</w:t>
+      </w:r>
+    </w:p>
+    <w:p>
+      <w:pPr/>
+      <w:r>
+        <w:rPr>
+          <w:b/>
+        </w:rPr>
+        <w:t xml:space="preserve">Result:  </w:t>
+      </w:r>
+      <w:r>
+        <w:t>acercadeadc.html — opening section rewritten to opportunity-led messaging emphasizing ADC's mission and community impact rather than neighborhood hardship.</w:t>
+      </w:r>
+    </w:p>
+    <w:p>
+      <w:pPr/>
+      <w:r/>
+    </w:p>
+    <w:p>
+      <w:pPr>
+        <w:pStyle w:val="Heading2"/>
+      </w:pPr>
+      <w:r>
+        <w:t>Prompt 44: Remove the problem statement callout from Acerca de ADC</w:t>
+      </w:r>
+    </w:p>
+    <w:p>
+      <w:pPr/>
+      <w:r>
+        <w:rPr>
+          <w:b/>
+        </w:rPr>
+        <w:t xml:space="preserve">Request:  </w:t>
+      </w:r>
+      <w:r>
+        <w:t>Remove the problem statement callout block from the Acerca de ADC page entirely.</w:t>
+      </w:r>
+    </w:p>
+    <w:p>
+      <w:pPr/>
+      <w:r>
+        <w:rPr>
+          <w:b/>
+        </w:rPr>
+        <w:t xml:space="preserve">Result:  </w:t>
+      </w:r>
+      <w:r>
+        <w:t>acercadeadc.html — problem statement callout section removed from the page.</w:t>
+      </w:r>
+    </w:p>
+    <w:p>
+      <w:pPr/>
+      <w:r/>
+    </w:p>
+    <w:p>
+      <w:pPr>
+        <w:pStyle w:val="Heading2"/>
+      </w:pPr>
+      <w:r>
+        <w:t>Prompt 45: Fix the Logotipo section background color</w:t>
+      </w:r>
+    </w:p>
+    <w:p>
+      <w:pPr/>
+      <w:r>
+        <w:rPr>
+          <w:b/>
+        </w:rPr>
+        <w:t xml:space="preserve">Request:  </w:t>
+      </w:r>
+      <w:r>
+        <w:t>The Logotipo (sponsors) section has a background color that doesn't match the white of the sponsor images.</w:t>
+      </w:r>
+    </w:p>
+    <w:p>
+      <w:pPr/>
+      <w:r>
+        <w:rPr>
+          <w:b/>
+        </w:rPr>
+        <w:t xml:space="preserve">Result:  </w:t>
+      </w:r>
+      <w:r>
+        <w:t>styles.css — logotipo section background corrected to match the image white, eliminating the visible color mismatch.</w:t>
+      </w:r>
+    </w:p>
+    <w:p>
+      <w:pPr/>
+      <w:r/>
+    </w:p>
+    <w:p>
+      <w:pPr>
+        <w:pStyle w:val="Heading2"/>
+      </w:pPr>
+      <w:r>
+        <w:t>Prompt 46: Remove logotipo border and shadow, fade edges into background</w:t>
+      </w:r>
+    </w:p>
+    <w:p>
+      <w:pPr/>
+      <w:r>
+        <w:rPr>
+          <w:b/>
+        </w:rPr>
+        <w:t xml:space="preserve">Request:  </w:t>
+      </w:r>
+      <w:r>
+        <w:t>Remove the border and drop shadow from the logotipo section and fade the edges of the sponsor bar into the background.</w:t>
+      </w:r>
+    </w:p>
+    <w:p>
+      <w:pPr/>
+      <w:r>
+        <w:rPr>
+          <w:b/>
+        </w:rPr>
+        <w:t xml:space="preserve">Result:  </w:t>
+      </w:r>
+      <w:r>
+        <w:t>styles.css — logotipo border and box-shadow removed; edge fade gradient applied so the sponsor bar blends seamlessly into the page background.</w:t>
+      </w:r>
+    </w:p>
+    <w:p>
+      <w:pPr/>
+      <w:r/>
+    </w:p>
+    <w:p>
+      <w:pPr>
+        <w:pStyle w:val="Heading2"/>
+      </w:pPr>
+      <w:r>
+        <w:t>Prompt 47: Build a private admin dashboard panel embedded across all pages</w:t>
+      </w:r>
+    </w:p>
+    <w:p>
+      <w:pPr/>
+      <w:r>
+        <w:rPr>
+          <w:b/>
+        </w:rPr>
+        <w:t xml:space="preserve">Request:  </w:t>
+      </w:r>
+      <w:r>
+        <w:t>Build a private admin panel that can be accessed from any page of the ADC website. It should be password-protected, include a full AI grant proposal writer, a site to-do list (pendientes), and links to grant resources.</w:t>
+      </w:r>
+    </w:p>
+    <w:p>
+      <w:pPr/>
+      <w:r>
+        <w:rPr>
+          <w:b/>
+        </w:rPr>
+        <w:t xml:space="preserve">Result:  </w:t>
+      </w:r>
+      <w:r>
+        <w:t>admin.js created — a self-contained admin overlay injected via script tag into all 11 pages. Features: password-gated session (sessionStorage persists across navigation); full grant builder form with funder, amount, focus area, document type, tone, language, word limit, deadline, section checkboxes, and free-form grant questions; collapsible ADC context editor pre-filled with org profile; save/load/delete grant drafts via localStorage; 10 grant resource links (US Soccer Foundation, FIFA, UNICEF, etc.); site pendientes to-do list; session proposal counter and draft count on dashboard.</w:t>
+      </w:r>
+    </w:p>
+    <w:p>
+      <w:pPr/>
+      <w:r/>
+    </w:p>
+    <w:p>
+      <w:pPr>
+        <w:pStyle w:val="Heading2"/>
+      </w:pPr>
+      <w:r>
+        <w:t>Prompt 48: Move the Administración access link to the footer</w:t>
+      </w:r>
+    </w:p>
+    <w:p>
+      <w:pPr/>
+      <w:r>
+        <w:rPr>
+          <w:b/>
+        </w:rPr>
+        <w:t xml:space="preserve">Request:  </w:t>
+      </w:r>
+      <w:r>
+        <w:t>Move the Administración access trigger from a fixed bottom-left overlay position to the footer area so it scrolls naturally with the page instead of floating over content.</w:t>
+      </w:r>
+    </w:p>
+    <w:p>
+      <w:pPr/>
+      <w:r>
+        <w:rPr>
+          <w:b/>
+        </w:rPr>
+        <w:t xml:space="preserve">Result:  </w:t>
+      </w:r>
+      <w:r>
+        <w:t>admin.js updated — trigger button repositioned to the footer copyright line on all pages, anchored to the page scroll rather than fixed to the viewport.</w:t>
+      </w:r>
+    </w:p>
+    <w:p>
+      <w:pPr/>
+      <w:r/>
+    </w:p>
+    <w:p>
+      <w:pPr>
+        <w:pStyle w:val="Heading2"/>
+      </w:pPr>
+      <w:r>
+        <w:t>Prompt 49: Security hardening, Google Analytics panel, expanded pendientes</w:t>
+      </w:r>
+    </w:p>
+    <w:p>
+      <w:pPr/>
+      <w:r>
+        <w:rPr>
+          <w:b/>
+        </w:rPr>
+        <w:t xml:space="preserve">Request:  </w:t>
+      </w:r>
+      <w:r>
+        <w:t>Harden the admin panel password security. Add a Google Analytics quick-access panel. Expand the site pendientes list with detailed, actionable items sourced from the ADC documentation files.</w:t>
+      </w:r>
+    </w:p>
+    <w:p>
+      <w:pPr/>
+      <w:r>
+        <w:rPr>
+          <w:b/>
+        </w:rPr>
+        <w:t xml:space="preserve">Result:  </w:t>
+      </w:r>
+      <w:r>
+        <w:t>admin.js — password replaced with SHA-256 hash comparison via the Web Crypto API so the plaintext password is never stored or compared directly. GA4 panel added with 8 shortcut links to key GA4 reports (realtime, pages, traffic, geo, devices, Search Console) and a property info card showing the Measurement ID (G-5VQJH72CD2). Pendientes rewritten from 15 generic items to 15 detailed accordion entries sourced from ADC_Improvements.docx, ADC_Info_Needed.docx, and ADC_Prompts_Historial.docx — each with a category tag (URGENTE / CONTENIDO / FUNCIÓN / TRANSFERENCIA), expanded detail text, and step-by-step action items with a responsible party.</w:t>
+      </w:r>
+    </w:p>
+    <w:p>
+      <w:pPr/>
+      <w:r/>
+    </w:p>
+    <w:p>
+      <w:pPr>
+        <w:pStyle w:val="Heading2"/>
+      </w:pPr>
+      <w:r>
+        <w:t>Prompt 50: Fix pendientes accordion rendering and remove duplicate logout button</w:t>
+      </w:r>
+    </w:p>
+    <w:p>
+      <w:pPr/>
+      <w:r>
+        <w:rPr>
+          <w:b/>
+        </w:rPr>
+        <w:t xml:space="preserve">Request:  </w:t>
+      </w:r>
+      <w:r>
+        <w:t>The pendientes accordion items are not rendering. There is also a duplicate Cerrar sesión button appearing in the panel.</w:t>
+      </w:r>
+    </w:p>
+    <w:p>
+      <w:pPr/>
+      <w:r>
+        <w:rPr>
+          <w:b/>
+        </w:rPr>
+        <w:t xml:space="preserve">Result:  </w:t>
+      </w:r>
+      <w:r>
+        <w:t>admin.js — stale .adm-pending-list CSS that was blocking accordion render removed. Duplicate 'Cerrar sesión' button removed, keeping only the '✕ Cerrar' close button. Orphaned logoutBtn variable and event listener cleaned up.</w:t>
+      </w:r>
+    </w:p>
+    <w:p>
+      <w:pPr/>
+      <w:r/>
+    </w:p>
+    <w:p>
+      <w:pPr>
+        <w:pStyle w:val="Heading2"/>
+      </w:pPr>
+      <w:r>
+        <w:t>Prompt 51: Update Worker URL in admin.js — Cloudflare Worker now deployed</w:t>
+      </w:r>
+    </w:p>
+    <w:p>
+      <w:pPr/>
+      <w:r>
+        <w:rPr>
+          <w:b/>
+        </w:rPr>
+        <w:t xml:space="preserve">Request:  </w:t>
+      </w:r>
+      <w:r>
+        <w:t>The Cloudflare Worker has been deployed and is live. Update admin.js to point to the live Worker URL so the grant writer calls the real Claude API instead of showing a demo error.</w:t>
+      </w:r>
+    </w:p>
+    <w:p>
+      <w:pPr/>
+      <w:r>
+        <w:rPr>
+          <w:b/>
+        </w:rPr>
+        <w:t xml:space="preserve">Result:  </w:t>
+      </w:r>
+      <w:r>
+        <w:t>admin.js — Worker URL updated from placeholder to the live endpoint: adc-grant-proxy.adcurundu.workers.dev. Grant writer now routes API calls through the deployed Cloudflare Worker to the real Claude API (llama-3.3-70b-versatile via Groq). Deployment marked complete in documentation.</w:t>
+      </w:r>
+    </w:p>
     <w:sectPr>
       <w:pgSz w:w="12240" w:h="15840"/>
       <w:pgMar w:top="1440" w:right="1800" w:bottom="1440" w:left="1800" w:header="720" w:footer="720" w:gutter="0"/>

</xml_diff>